<commit_message>
Se actualizó el documento del avance
</commit_message>
<xml_diff>
--- a/Avance 1/Explicación del avance.docx
+++ b/Avance 1/Explicación del avance.docx
@@ -420,6 +420,162 @@
       </w:pPr>
       <w:r>
         <w:t>Todo esto se muestra en una interfaz con colores cálidos y fuente Arial, lo que mejora la experiencia visual.</w:t>
+      </w:r>
+    </w:p>
+    <w:p>
+      <w:pPr>
+        <w:pStyle w:val="Ttulo"/>
+      </w:pPr>
+    </w:p>
+    <w:p>
+      <w:pPr>
+        <w:pStyle w:val="Ttulo"/>
+      </w:pPr>
+      <w:r>
+        <w:lastRenderedPageBreak/>
+        <w:t xml:space="preserve">Avance 2 </w:t>
+      </w:r>
+    </w:p>
+    <w:p>
+      <w:pPr>
+        <w:pStyle w:val="Ttulo"/>
+        <w:jc w:val="right"/>
+      </w:pPr>
+      <w:r>
+        <w:rPr>
+          <w:sz w:val="22"/>
+          <w:szCs w:val="22"/>
+        </w:rPr>
+        <w:t>03/08/2026</w:t>
+      </w:r>
+    </w:p>
+    <w:p>
+      <w:r>
+        <w:t xml:space="preserve">Durante la sesión de trabajo de hoy se realizaron mejoras enfocadas en la </w:t>
+      </w:r>
+      <w:r>
+        <w:rPr>
+          <w:b/>
+          <w:bCs/>
+        </w:rPr>
+        <w:t>interfaz gráfica y la presentación del catálogo</w:t>
+      </w:r>
+      <w:r>
+        <w:t xml:space="preserve"> dentro de la aplicación de tienda artesanal:</w:t>
+      </w:r>
+    </w:p>
+    <w:p>
+      <w:pPr>
+        <w:numPr>
+          <w:ilvl w:val="0"/>
+          <w:numId w:val="6"/>
+        </w:numPr>
+      </w:pPr>
+      <w:r>
+        <w:rPr>
+          <w:b/>
+          <w:bCs/>
+        </w:rPr>
+        <w:t>Ampliación del catálogo:</w:t>
+      </w:r>
+      <w:r>
+        <w:t xml:space="preserve"> Se añadieron nuevos productos artesanales (pulsera tejida, collar artesanal, bolsa bordada, taza artesanal, cuadro pintado a mano, jarrón de cerámica, atrapasueños y velas aromáticas).</w:t>
+      </w:r>
+    </w:p>
+    <w:p>
+      <w:pPr>
+        <w:numPr>
+          <w:ilvl w:val="0"/>
+          <w:numId w:val="6"/>
+        </w:numPr>
+      </w:pPr>
+      <w:r>
+        <w:rPr>
+          <w:b/>
+          <w:bCs/>
+        </w:rPr>
+        <w:t>Corrección de etiquetas duplicadas:</w:t>
+      </w:r>
+      <w:r>
+        <w:t xml:space="preserve"> Se ajustaron las secciones de “Catálogo” y “Carrito” para que se muestren de forma clara y uniforme, con fuente Arial y centradas.</w:t>
+      </w:r>
+    </w:p>
+    <w:p>
+      <w:pPr>
+        <w:numPr>
+          <w:ilvl w:val="0"/>
+          <w:numId w:val="6"/>
+        </w:numPr>
+      </w:pPr>
+      <w:r>
+        <w:rPr>
+          <w:b/>
+          <w:bCs/>
+        </w:rPr>
+        <w:t>Estilización de la interfaz:</w:t>
+      </w:r>
+      <w:r>
+        <w:t xml:space="preserve"> Se aplicaron colores cálidos (beige, café y crema) y botones con tonos de madera, reforzando la identidad visual artesanal.</w:t>
+      </w:r>
+    </w:p>
+    <w:p>
+      <w:pPr>
+        <w:numPr>
+          <w:ilvl w:val="0"/>
+          <w:numId w:val="6"/>
+        </w:numPr>
+      </w:pPr>
+      <w:r>
+        <w:rPr>
+          <w:b/>
+          <w:bCs/>
+        </w:rPr>
+        <w:t>Preparación para integración de imágenes:</w:t>
+      </w:r>
+      <w:r>
+        <w:t xml:space="preserve"> Se creó la carpeta </w:t>
+      </w:r>
+      <w:proofErr w:type="spellStart"/>
+      <w:r>
+        <w:t>src</w:t>
+      </w:r>
+      <w:proofErr w:type="spellEnd"/>
+      <w:r>
+        <w:t>/</w:t>
+      </w:r>
+      <w:proofErr w:type="spellStart"/>
+      <w:r>
+        <w:t>images</w:t>
+      </w:r>
+      <w:proofErr w:type="spellEnd"/>
+      <w:r>
+        <w:t xml:space="preserve">/ para almacenar los recursos gráficos y se configuró un </w:t>
+      </w:r>
+      <w:proofErr w:type="spellStart"/>
+      <w:r>
+        <w:t>renderer</w:t>
+      </w:r>
+      <w:proofErr w:type="spellEnd"/>
+      <w:r>
+        <w:t xml:space="preserve"> en el catálogo que permite mostrar cada producto acompañado de su imagen, escalada a un tamaño uniforme.</w:t>
+      </w:r>
+    </w:p>
+    <w:p>
+      <w:pPr>
+        <w:numPr>
+          <w:ilvl w:val="0"/>
+          <w:numId w:val="6"/>
+        </w:numPr>
+      </w:pPr>
+      <w:r>
+        <w:rPr>
+          <w:b/>
+          <w:bCs/>
+        </w:rPr>
+        <w:t>Exploración de empaquetado en .exe:</w:t>
+      </w:r>
+      <w:r>
+        <w:t xml:space="preserve"> Se revisó la posibilidad de convertir la aplicación en un ejecutable para Windows, aunque se decidió dejar esta tarea para más adelante.</w:t>
       </w:r>
     </w:p>
     <w:p/>
@@ -585,6 +741,155 @@
     </w:lvl>
   </w:abstractNum>
   <w:abstractNum w:abstractNumId="1" w15:restartNumberingAfterBreak="0">
+    <w:nsid w:val="2987584D"/>
+    <w:multiLevelType w:val="multilevel"/>
+    <w:tmpl w:val="7570B07C"/>
+    <w:lvl w:ilvl="0">
+      <w:start w:val="1"/>
+      <w:numFmt w:val="bullet"/>
+      <w:lvlText w:val=""/>
+      <w:lvlJc w:val="left"/>
+      <w:pPr>
+        <w:tabs>
+          <w:tab w:val="num" w:pos="720"/>
+        </w:tabs>
+        <w:ind w:left="720" w:hanging="360"/>
+      </w:pPr>
+      <w:rPr>
+        <w:rFonts w:ascii="Symbol" w:hAnsi="Symbol" w:hint="default"/>
+        <w:sz w:val="20"/>
+      </w:rPr>
+    </w:lvl>
+    <w:lvl w:ilvl="1" w:tentative="1">
+      <w:start w:val="1"/>
+      <w:numFmt w:val="bullet"/>
+      <w:lvlText w:val="o"/>
+      <w:lvlJc w:val="left"/>
+      <w:pPr>
+        <w:tabs>
+          <w:tab w:val="num" w:pos="1440"/>
+        </w:tabs>
+        <w:ind w:left="1440" w:hanging="360"/>
+      </w:pPr>
+      <w:rPr>
+        <w:rFonts w:ascii="Courier New" w:hAnsi="Courier New" w:hint="default"/>
+        <w:sz w:val="20"/>
+      </w:rPr>
+    </w:lvl>
+    <w:lvl w:ilvl="2" w:tentative="1">
+      <w:start w:val="1"/>
+      <w:numFmt w:val="bullet"/>
+      <w:lvlText w:val=""/>
+      <w:lvlJc w:val="left"/>
+      <w:pPr>
+        <w:tabs>
+          <w:tab w:val="num" w:pos="2160"/>
+        </w:tabs>
+        <w:ind w:left="2160" w:hanging="360"/>
+      </w:pPr>
+      <w:rPr>
+        <w:rFonts w:ascii="Wingdings" w:hAnsi="Wingdings" w:hint="default"/>
+        <w:sz w:val="20"/>
+      </w:rPr>
+    </w:lvl>
+    <w:lvl w:ilvl="3" w:tentative="1">
+      <w:start w:val="1"/>
+      <w:numFmt w:val="bullet"/>
+      <w:lvlText w:val=""/>
+      <w:lvlJc w:val="left"/>
+      <w:pPr>
+        <w:tabs>
+          <w:tab w:val="num" w:pos="2880"/>
+        </w:tabs>
+        <w:ind w:left="2880" w:hanging="360"/>
+      </w:pPr>
+      <w:rPr>
+        <w:rFonts w:ascii="Wingdings" w:hAnsi="Wingdings" w:hint="default"/>
+        <w:sz w:val="20"/>
+      </w:rPr>
+    </w:lvl>
+    <w:lvl w:ilvl="4" w:tentative="1">
+      <w:start w:val="1"/>
+      <w:numFmt w:val="bullet"/>
+      <w:lvlText w:val=""/>
+      <w:lvlJc w:val="left"/>
+      <w:pPr>
+        <w:tabs>
+          <w:tab w:val="num" w:pos="3600"/>
+        </w:tabs>
+        <w:ind w:left="3600" w:hanging="360"/>
+      </w:pPr>
+      <w:rPr>
+        <w:rFonts w:ascii="Wingdings" w:hAnsi="Wingdings" w:hint="default"/>
+        <w:sz w:val="20"/>
+      </w:rPr>
+    </w:lvl>
+    <w:lvl w:ilvl="5" w:tentative="1">
+      <w:start w:val="1"/>
+      <w:numFmt w:val="bullet"/>
+      <w:lvlText w:val=""/>
+      <w:lvlJc w:val="left"/>
+      <w:pPr>
+        <w:tabs>
+          <w:tab w:val="num" w:pos="4320"/>
+        </w:tabs>
+        <w:ind w:left="4320" w:hanging="360"/>
+      </w:pPr>
+      <w:rPr>
+        <w:rFonts w:ascii="Wingdings" w:hAnsi="Wingdings" w:hint="default"/>
+        <w:sz w:val="20"/>
+      </w:rPr>
+    </w:lvl>
+    <w:lvl w:ilvl="6" w:tentative="1">
+      <w:start w:val="1"/>
+      <w:numFmt w:val="bullet"/>
+      <w:lvlText w:val=""/>
+      <w:lvlJc w:val="left"/>
+      <w:pPr>
+        <w:tabs>
+          <w:tab w:val="num" w:pos="5040"/>
+        </w:tabs>
+        <w:ind w:left="5040" w:hanging="360"/>
+      </w:pPr>
+      <w:rPr>
+        <w:rFonts w:ascii="Wingdings" w:hAnsi="Wingdings" w:hint="default"/>
+        <w:sz w:val="20"/>
+      </w:rPr>
+    </w:lvl>
+    <w:lvl w:ilvl="7" w:tentative="1">
+      <w:start w:val="1"/>
+      <w:numFmt w:val="bullet"/>
+      <w:lvlText w:val=""/>
+      <w:lvlJc w:val="left"/>
+      <w:pPr>
+        <w:tabs>
+          <w:tab w:val="num" w:pos="5760"/>
+        </w:tabs>
+        <w:ind w:left="5760" w:hanging="360"/>
+      </w:pPr>
+      <w:rPr>
+        <w:rFonts w:ascii="Wingdings" w:hAnsi="Wingdings" w:hint="default"/>
+        <w:sz w:val="20"/>
+      </w:rPr>
+    </w:lvl>
+    <w:lvl w:ilvl="8" w:tentative="1">
+      <w:start w:val="1"/>
+      <w:numFmt w:val="bullet"/>
+      <w:lvlText w:val=""/>
+      <w:lvlJc w:val="left"/>
+      <w:pPr>
+        <w:tabs>
+          <w:tab w:val="num" w:pos="6480"/>
+        </w:tabs>
+        <w:ind w:left="6480" w:hanging="360"/>
+      </w:pPr>
+      <w:rPr>
+        <w:rFonts w:ascii="Wingdings" w:hAnsi="Wingdings" w:hint="default"/>
+        <w:sz w:val="20"/>
+      </w:rPr>
+    </w:lvl>
+  </w:abstractNum>
+  <w:abstractNum w:abstractNumId="2" w15:restartNumberingAfterBreak="0">
     <w:nsid w:val="42713C2B"/>
     <w:multiLevelType w:val="multilevel"/>
     <w:tmpl w:val="4BC8C0F0"/>
@@ -733,7 +1038,7 @@
       </w:rPr>
     </w:lvl>
   </w:abstractNum>
-  <w:abstractNum w:abstractNumId="2" w15:restartNumberingAfterBreak="0">
+  <w:abstractNum w:abstractNumId="3" w15:restartNumberingAfterBreak="0">
     <w:nsid w:val="46E1663E"/>
     <w:multiLevelType w:val="multilevel"/>
     <w:tmpl w:val="38F8CF86"/>
@@ -846,7 +1151,7 @@
       </w:pPr>
     </w:lvl>
   </w:abstractNum>
-  <w:abstractNum w:abstractNumId="3" w15:restartNumberingAfterBreak="0">
+  <w:abstractNum w:abstractNumId="4" w15:restartNumberingAfterBreak="0">
     <w:nsid w:val="5C306470"/>
     <w:multiLevelType w:val="multilevel"/>
     <w:tmpl w:val="C60066B2"/>
@@ -995,7 +1300,7 @@
       </w:rPr>
     </w:lvl>
   </w:abstractNum>
-  <w:abstractNum w:abstractNumId="4" w15:restartNumberingAfterBreak="0">
+  <w:abstractNum w:abstractNumId="5" w15:restartNumberingAfterBreak="0">
     <w:nsid w:val="6F3221B1"/>
     <w:multiLevelType w:val="multilevel"/>
     <w:tmpl w:val="4BC8C0F0"/>
@@ -1145,19 +1450,22 @@
     </w:lvl>
   </w:abstractNum>
   <w:num w:numId="1" w16cid:durableId="655114885">
-    <w:abstractNumId w:val="3"/>
+    <w:abstractNumId w:val="4"/>
   </w:num>
   <w:num w:numId="2" w16cid:durableId="759256147">
     <w:abstractNumId w:val="0"/>
   </w:num>
   <w:num w:numId="3" w16cid:durableId="1852454846">
+    <w:abstractNumId w:val="3"/>
+  </w:num>
+  <w:num w:numId="4" w16cid:durableId="1542475665">
     <w:abstractNumId w:val="2"/>
   </w:num>
-  <w:num w:numId="4" w16cid:durableId="1542475665">
+  <w:num w:numId="5" w16cid:durableId="816461529">
+    <w:abstractNumId w:val="5"/>
+  </w:num>
+  <w:num w:numId="6" w16cid:durableId="227499227">
     <w:abstractNumId w:val="1"/>
-  </w:num>
-  <w:num w:numId="5" w16cid:durableId="816461529">
-    <w:abstractNumId w:val="4"/>
   </w:num>
 </w:numbering>
 </file>

</xml_diff>